<commit_message>
Add Citi enterprise adoption Q&A (plain English)
Q20: Personal laptop → Citi (recipe book analogy)
  - What moves to Citi (recipe book / .md files)
  - What stays out (personal laptop, personal Claude account)
  - What Citi provides (their AI vendor, network, code)
  - Why Citi won't worry (4 plain-English answers)

Q21: How to convince Citi to use this
  - Step 1: Get permission first (InfoSec, AI Governance, Compliance)
  - Step 2: Pick smallest, safest pilot
  - Step 3: Measure 4 numbers (throughput, bugs, coordination, happiness)
  - Step 4: Answer objections before they ask (5 common pushbacks)
  - One-liner for the director
</commit_message>
<xml_diff>
--- a/demo-assets/director-qa.docx
+++ b/demo-assets/director-qa.docx
@@ -1209,6 +1209,651 @@
       </w:pPr>
       <w:r>
         <w:t xml:space="preserve">Edit the .md files to add our coding standards, naming conventions, tech-stack preferences, or compliance constraints. Takes 15 minutes per agent.</w:t>
+      </w:r>
+    </w:p>
+    <w:p>
+      <w:pPr>
+        <w:pBdr>
+          <w:bottom w:val="single" w:color="2E75B6" w:sz="6" w:space="4"/>
+        </w:pBdr>
+        <w:spacing w:after="200" w:before="120"/>
+      </w:pPr>
+      <w:r>
+        <w:t xml:space="preserve"/>
+      </w:r>
+    </w:p>
+    <w:p>
+      <w:pPr>
+        <w:pStyle w:val="Heading2"/>
+        <w:spacing w:after="160" w:before="280"/>
+      </w:pPr>
+      <w:r>
+        <w:t xml:space="preserve">Section 3: Bringing This Into Citi (Enterprise Adoption)</w:t>
+      </w:r>
+    </w:p>
+    <w:p>
+      <w:pPr>
+        <w:spacing w:after="120" w:before="280"/>
+      </w:pPr>
+      <w:r>
+        <w:rPr>
+          <w:b/>
+          <w:bCs/>
+          <w:color w:val="1F3864"/>
+          <w:sz w:val="26"/>
+          <w:szCs w:val="26"/>
+        </w:rPr>
+        <w:t xml:space="preserve">Q20. </w:t>
+      </w:r>
+      <w:r>
+        <w:rPr>
+          <w:b/>
+          <w:bCs/>
+          <w:color w:val="1F3864"/>
+          <w:sz w:val="26"/>
+          <w:szCs w:val="26"/>
+        </w:rPr>
+        <w:t xml:space="preserve">This was built on my personal laptop. How can it work inside Citi?</w:t>
+      </w:r>
+    </w:p>
+    <w:p>
+      <w:pPr>
+        <w:spacing w:after="120" w:before="100"/>
+        <w:ind w:left="240"/>
+      </w:pPr>
+      <w:r>
+        <w:rPr>
+          <w:b/>
+          <w:bCs/>
+          <w:color w:val="1F3864"/>
+          <w:sz w:val="26"/>
+          <w:szCs w:val="26"/>
+        </w:rPr>
+        <w:t xml:space="preserve">Think of it like a recipe book.</w:t>
+      </w:r>
+    </w:p>
+    <w:p>
+      <w:pPr>
+        <w:spacing w:after="120"/>
+        <w:ind w:left="240"/>
+      </w:pPr>
+      <w:r>
+        <w:t xml:space="preserve">I wrote a recipe book at home — how to bake a cake, step by step. The recipe book is just words on paper. There's nothing dangerous or secret in it.</w:t>
+      </w:r>
+    </w:p>
+    <w:p>
+      <w:pPr>
+        <w:spacing w:after="120"/>
+        <w:ind w:left="240"/>
+      </w:pPr>
+      <w:r>
+        <w:t xml:space="preserve">Now I want to bake cakes in Citi's kitchen.</w:t>
+      </w:r>
+    </w:p>
+    <w:p>
+      <w:pPr>
+        <w:spacing w:after="80" w:before="160"/>
+        <w:ind w:left="240"/>
+      </w:pPr>
+      <w:r>
+        <w:rPr>
+          <w:b/>
+          <w:bCs/>
+          <w:color w:val="2E7D32"/>
+          <w:sz w:val="22"/>
+          <w:szCs w:val="22"/>
+        </w:rPr>
+        <w:t xml:space="preserve">What moves to Citi:</w:t>
+      </w:r>
+    </w:p>
+    <w:p>
+      <w:pPr>
+        <w:pStyle w:val="ListParagraph"/>
+        <w:numPr>
+          <w:ilvl w:val="0"/>
+          <w:numId w:val="2"/>
+        </w:numPr>
+        <w:spacing w:after="80"/>
+      </w:pPr>
+      <w:r>
+        <w:t xml:space="preserve">The recipe book (the agent .md files) — just plain English instructions</w:t>
+      </w:r>
+    </w:p>
+    <w:p>
+      <w:pPr>
+        <w:spacing w:after="80" w:before="160"/>
+        <w:ind w:left="240"/>
+      </w:pPr>
+      <w:r>
+        <w:rPr>
+          <w:b/>
+          <w:bCs/>
+          <w:color w:val="C0392B"/>
+          <w:sz w:val="22"/>
+          <w:szCs w:val="22"/>
+        </w:rPr>
+        <w:t xml:space="preserve">What stays out of Citi:</w:t>
+      </w:r>
+    </w:p>
+    <w:p>
+      <w:pPr>
+        <w:pStyle w:val="ListParagraph"/>
+        <w:numPr>
+          <w:ilvl w:val="0"/>
+          <w:numId w:val="2"/>
+        </w:numPr>
+        <w:spacing w:after="80"/>
+      </w:pPr>
+      <w:r>
+        <w:t xml:space="preserve">My home oven (my personal laptop)</w:t>
+      </w:r>
+    </w:p>
+    <w:p>
+      <w:pPr>
+        <w:pStyle w:val="ListParagraph"/>
+        <w:numPr>
+          <w:ilvl w:val="0"/>
+          <w:numId w:val="2"/>
+        </w:numPr>
+        <w:spacing w:after="80"/>
+      </w:pPr>
+      <w:r>
+        <w:t xml:space="preserve">My personal ingredients (my Claude account)</w:t>
+      </w:r>
+    </w:p>
+    <w:p>
+      <w:pPr>
+        <w:spacing w:after="80" w:before="160"/>
+        <w:ind w:left="240"/>
+      </w:pPr>
+      <w:r>
+        <w:rPr>
+          <w:b/>
+          <w:bCs/>
+          <w:color w:val="1F3864"/>
+          <w:sz w:val="22"/>
+          <w:szCs w:val="22"/>
+        </w:rPr>
+        <w:t xml:space="preserve">What Citi provides:</w:t>
+      </w:r>
+    </w:p>
+    <w:p>
+      <w:pPr>
+        <w:pStyle w:val="ListParagraph"/>
+        <w:numPr>
+          <w:ilvl w:val="0"/>
+          <w:numId w:val="2"/>
+        </w:numPr>
+        <w:spacing w:after="80"/>
+      </w:pPr>
+      <w:r>
+        <w:t xml:space="preserve">Citi's own oven (their approved AI vendor)</w:t>
+      </w:r>
+    </w:p>
+    <w:p>
+      <w:pPr>
+        <w:pStyle w:val="ListParagraph"/>
+        <w:numPr>
+          <w:ilvl w:val="0"/>
+          <w:numId w:val="2"/>
+        </w:numPr>
+        <w:spacing w:after="80"/>
+      </w:pPr>
+      <w:r>
+        <w:t xml:space="preserve">Citi's own kitchen (their secure network)</w:t>
+      </w:r>
+    </w:p>
+    <w:p>
+      <w:pPr>
+        <w:pStyle w:val="ListParagraph"/>
+        <w:numPr>
+          <w:ilvl w:val="0"/>
+          <w:numId w:val="2"/>
+        </w:numPr>
+        <w:spacing w:after="80"/>
+      </w:pPr>
+      <w:r>
+        <w:t xml:space="preserve">Citi's own ingredients (their code, their data)</w:t>
+      </w:r>
+    </w:p>
+    <w:p>
+      <w:pPr>
+        <w:spacing w:after="100" w:before="200"/>
+        <w:ind w:left="240"/>
+      </w:pPr>
+      <w:r>
+        <w:rPr>
+          <w:b/>
+          <w:bCs/>
+          <w:color w:val="1F3864"/>
+          <w:sz w:val="24"/>
+          <w:szCs w:val="24"/>
+        </w:rPr>
+        <w:t xml:space="preserve">Why Citi won't worry:</w:t>
+      </w:r>
+    </w:p>
+    <w:p>
+      <w:pPr>
+        <w:pStyle w:val="ListParagraph"/>
+        <w:numPr>
+          <w:ilvl w:val="0"/>
+          <w:numId w:val="2"/>
+        </w:numPr>
+        <w:spacing w:after="80"/>
+      </w:pPr>
+      <w:r>
+        <w:t xml:space="preserve">Will Citi data leak out? → No. Everything runs inside their network.</w:t>
+      </w:r>
+    </w:p>
+    <w:p>
+      <w:pPr>
+        <w:pStyle w:val="ListParagraph"/>
+        <w:numPr>
+          <w:ilvl w:val="0"/>
+          <w:numId w:val="2"/>
+        </w:numPr>
+        <w:spacing w:after="80"/>
+      </w:pPr>
+      <w:r>
+        <w:t xml:space="preserve">Did I copy any Citi code? → No. The recipe book has zero Citi content.</w:t>
+      </w:r>
+    </w:p>
+    <w:p>
+      <w:pPr>
+        <w:pStyle w:val="ListParagraph"/>
+        <w:numPr>
+          <w:ilvl w:val="0"/>
+          <w:numId w:val="2"/>
+        </w:numPr>
+        <w:spacing w:after="80"/>
+      </w:pPr>
+      <w:r>
+        <w:t xml:space="preserve">Is this Anthropic-only? → No. Recipes work with any AI brand Citi approves.</w:t>
+      </w:r>
+    </w:p>
+    <w:p>
+      <w:pPr>
+        <w:pStyle w:val="ListParagraph"/>
+        <w:numPr>
+          <w:ilvl w:val="0"/>
+          <w:numId w:val="2"/>
+        </w:numPr>
+        <w:spacing w:after="80"/>
+      </w:pPr>
+      <w:r>
+        <w:t xml:space="preserve">What if AI vendor changes? → Swap the vendor. The recipes still work.</w:t>
+      </w:r>
+    </w:p>
+    <w:p>
+      <w:pPr>
+        <w:spacing w:after="120"/>
+        <w:ind w:left="240"/>
+      </w:pPr>
+      <w:r>
+        <w:rPr>
+          <w:b/>
+          <w:bCs/>
+          <w:i/>
+          <w:iCs/>
+          <w:color w:val="2E7D32"/>
+        </w:rPr>
+        <w:t xml:space="preserve">Bottom line: ZERO new risk to Citi. The framework is just words.</w:t>
+      </w:r>
+    </w:p>
+    <w:p>
+      <w:pPr>
+        <w:spacing w:after="120" w:before="280"/>
+      </w:pPr>
+      <w:r>
+        <w:rPr>
+          <w:b/>
+          <w:bCs/>
+          <w:color w:val="1F3864"/>
+          <w:sz w:val="26"/>
+          <w:szCs w:val="26"/>
+        </w:rPr>
+        <w:t xml:space="preserve">Q21. </w:t>
+      </w:r>
+      <w:r>
+        <w:rPr>
+          <w:b/>
+          <w:bCs/>
+          <w:color w:val="1F3864"/>
+          <w:sz w:val="26"/>
+          <w:szCs w:val="26"/>
+        </w:rPr>
+        <w:t xml:space="preserve">How do I actually convince Citi to use this?</w:t>
+      </w:r>
+    </w:p>
+    <w:p>
+      <w:pPr>
+        <w:spacing w:after="120" w:before="100"/>
+        <w:ind w:left="240"/>
+      </w:pPr>
+      <w:r>
+        <w:rPr>
+          <w:b/>
+          <w:bCs/>
+          <w:color w:val="1F3864"/>
+          <w:sz w:val="26"/>
+          <w:szCs w:val="26"/>
+        </w:rPr>
+        <w:t xml:space="preserve">Move slowly. Banks hate fast.</w:t>
+      </w:r>
+    </w:p>
+    <w:p>
+      <w:pPr>
+        <w:spacing w:after="100" w:before="200"/>
+      </w:pPr>
+      <w:r>
+        <w:rPr>
+          <w:b/>
+          <w:bCs/>
+          <w:color w:val="1F3864"/>
+          <w:sz w:val="24"/>
+          <w:szCs w:val="24"/>
+        </w:rPr>
+        <w:t xml:space="preserve">Step 1 — Get Permission First</w:t>
+      </w:r>
+    </w:p>
+    <w:p>
+      <w:pPr>
+        <w:spacing w:after="120"/>
+        <w:ind w:left="240"/>
+      </w:pPr>
+      <w:r>
+        <w:t xml:space="preserve">Talk to 3 teams BEFORE writing any code:</w:t>
+      </w:r>
+    </w:p>
+    <w:p>
+      <w:pPr>
+        <w:pStyle w:val="ListParagraph"/>
+        <w:numPr>
+          <w:ilvl w:val="0"/>
+          <w:numId w:val="2"/>
+        </w:numPr>
+        <w:spacing w:after="80"/>
+      </w:pPr>
+      <w:r>
+        <w:t xml:space="preserve">InfoSec — "Is this safe?"</w:t>
+      </w:r>
+    </w:p>
+    <w:p>
+      <w:pPr>
+        <w:pStyle w:val="ListParagraph"/>
+        <w:numPr>
+          <w:ilvl w:val="0"/>
+          <w:numId w:val="2"/>
+        </w:numPr>
+        <w:spacing w:after="80"/>
+      </w:pPr>
+      <w:r>
+        <w:t xml:space="preserve">AI Governance — "Is this allowed?"</w:t>
+      </w:r>
+    </w:p>
+    <w:p>
+      <w:pPr>
+        <w:pStyle w:val="ListParagraph"/>
+        <w:numPr>
+          <w:ilvl w:val="0"/>
+          <w:numId w:val="2"/>
+        </w:numPr>
+        <w:spacing w:after="80"/>
+      </w:pPr>
+      <w:r>
+        <w:t xml:space="preserve">Compliance — "Will regulators be okay?"</w:t>
+      </w:r>
+    </w:p>
+    <w:p>
+      <w:pPr>
+        <w:spacing w:after="120"/>
+        <w:ind w:left="240"/>
+      </w:pPr>
+      <w:r>
+        <w:rPr>
+          <w:i/>
+          <w:iCs/>
+        </w:rPr>
+        <w:t xml:space="preserve">If any of them say no → stop. Don't fight. Find another use case.</w:t>
+      </w:r>
+    </w:p>
+    <w:p>
+      <w:pPr>
+        <w:spacing w:after="100" w:before="200"/>
+      </w:pPr>
+      <w:r>
+        <w:rPr>
+          <w:b/>
+          <w:bCs/>
+          <w:color w:val="1F3864"/>
+          <w:sz w:val="24"/>
+          <w:szCs w:val="24"/>
+        </w:rPr>
+        <w:t xml:space="preserve">Step 2 — Pick The Smallest, Safest Pilot</w:t>
+      </w:r>
+    </w:p>
+    <w:p>
+      <w:pPr>
+        <w:spacing w:after="120"/>
+        <w:ind w:left="240"/>
+      </w:pPr>
+      <w:r>
+        <w:t xml:space="preserve">Don't start with: customer apps, trading systems, payment systems.</w:t>
+      </w:r>
+    </w:p>
+    <w:p>
+      <w:pPr>
+        <w:spacing w:after="120"/>
+        <w:ind w:left="240"/>
+      </w:pPr>
+      <w:r>
+        <w:t xml:space="preserve">Do start with: internal docs, test generation, dev tooling.</w:t>
+      </w:r>
+    </w:p>
+    <w:p>
+      <w:pPr>
+        <w:spacing w:after="120"/>
+        <w:ind w:left="240"/>
+      </w:pPr>
+      <w:r>
+        <w:rPr>
+          <w:i/>
+          <w:iCs/>
+        </w:rPr>
+        <w:t xml:space="preserve">Why? If it goes wrong, nobody important gets hurt.</w:t>
+      </w:r>
+    </w:p>
+    <w:p>
+      <w:pPr>
+        <w:spacing w:after="100" w:before="200"/>
+      </w:pPr>
+      <w:r>
+        <w:rPr>
+          <w:b/>
+          <w:bCs/>
+          <w:color w:val="1F3864"/>
+          <w:sz w:val="24"/>
+          <w:szCs w:val="24"/>
+        </w:rPr>
+        <w:t xml:space="preserve">Step 3 — Measure 4 Numbers For 1 Sprint</w:t>
+      </w:r>
+    </w:p>
+    <w:p>
+      <w:pPr>
+        <w:pStyle w:val="ListParagraph"/>
+        <w:numPr>
+          <w:ilvl w:val="0"/>
+          <w:numId w:val="2"/>
+        </w:numPr>
+        <w:spacing w:after="80"/>
+      </w:pPr>
+      <w:r>
+        <w:t xml:space="preserve">Throughput — How many stories did the team finish?</w:t>
+      </w:r>
+    </w:p>
+    <w:p>
+      <w:pPr>
+        <w:pStyle w:val="ListParagraph"/>
+        <w:numPr>
+          <w:ilvl w:val="0"/>
+          <w:numId w:val="2"/>
+        </w:numPr>
+        <w:spacing w:after="80"/>
+      </w:pPr>
+      <w:r>
+        <w:t xml:space="preserve">Bugs — Did defects go up or down?</w:t>
+      </w:r>
+    </w:p>
+    <w:p>
+      <w:pPr>
+        <w:pStyle w:val="ListParagraph"/>
+        <w:numPr>
+          <w:ilvl w:val="0"/>
+          <w:numId w:val="2"/>
+        </w:numPr>
+        <w:spacing w:after="80"/>
+      </w:pPr>
+      <w:r>
+        <w:t xml:space="preserve">Coordination time — Did meetings reduce?</w:t>
+      </w:r>
+    </w:p>
+    <w:p>
+      <w:pPr>
+        <w:pStyle w:val="ListParagraph"/>
+        <w:numPr>
+          <w:ilvl w:val="0"/>
+          <w:numId w:val="2"/>
+        </w:numPr>
+        <w:spacing w:after="80"/>
+      </w:pPr>
+      <w:r>
+        <w:t xml:space="preserve">Team happiness — Do devs like it or hate it?</w:t>
+      </w:r>
+    </w:p>
+    <w:p>
+      <w:pPr>
+        <w:spacing w:after="120"/>
+        <w:ind w:left="240"/>
+      </w:pPr>
+      <w:r>
+        <w:rPr>
+          <w:b/>
+          <w:bCs/>
+          <w:i/>
+          <w:iCs/>
+        </w:rPr>
+        <w:t xml:space="preserve">Real numbers beat marketing slides.</w:t>
+      </w:r>
+    </w:p>
+    <w:p>
+      <w:pPr>
+        <w:spacing w:after="100" w:before="200"/>
+      </w:pPr>
+      <w:r>
+        <w:rPr>
+          <w:b/>
+          <w:bCs/>
+          <w:color w:val="1F3864"/>
+          <w:sz w:val="24"/>
+          <w:szCs w:val="24"/>
+        </w:rPr>
+        <w:t xml:space="preserve">Step 4 — Answer Objections Before They Ask</w:t>
+      </w:r>
+    </w:p>
+    <w:p>
+      <w:pPr>
+        <w:pStyle w:val="ListParagraph"/>
+        <w:numPr>
+          <w:ilvl w:val="0"/>
+          <w:numId w:val="2"/>
+        </w:numPr>
+        <w:spacing w:after="80"/>
+      </w:pPr>
+      <w:r>
+        <w:t xml:space="preserve">"This will replace engineers" → No. Humans approve every line. AI is the assistant, not the boss.</w:t>
+      </w:r>
+    </w:p>
+    <w:p>
+      <w:pPr>
+        <w:pStyle w:val="ListParagraph"/>
+        <w:numPr>
+          <w:ilvl w:val="0"/>
+          <w:numId w:val="2"/>
+        </w:numPr>
+        <w:spacing w:after="80"/>
+      </w:pPr>
+      <w:r>
+        <w:t xml:space="preserve">"AI makes mistakes" → Yes, that's why we review. Same as junior dev code today.</w:t>
+      </w:r>
+    </w:p>
+    <w:p>
+      <w:pPr>
+        <w:pStyle w:val="ListParagraph"/>
+        <w:numPr>
+          <w:ilvl w:val="0"/>
+          <w:numId w:val="2"/>
+        </w:numPr>
+        <w:spacing w:after="80"/>
+      </w:pPr>
+      <w:r>
+        <w:t xml:space="preserve">"Regulators won't allow it" → Regulators want explainability + human approval — both are built in.</w:t>
+      </w:r>
+    </w:p>
+    <w:p>
+      <w:pPr>
+        <w:pStyle w:val="ListParagraph"/>
+        <w:numPr>
+          <w:ilvl w:val="0"/>
+          <w:numId w:val="2"/>
+        </w:numPr>
+        <w:spacing w:after="80"/>
+      </w:pPr>
+      <w:r>
+        <w:t xml:space="preserve">"It costs money" → Less than one team coffee subscription per developer per month.</w:t>
+      </w:r>
+    </w:p>
+    <w:p>
+      <w:pPr>
+        <w:pStyle w:val="ListParagraph"/>
+        <w:numPr>
+          <w:ilvl w:val="0"/>
+          <w:numId w:val="2"/>
+        </w:numPr>
+        <w:spacing w:after="80"/>
+      </w:pPr>
+      <w:r>
+        <w:t xml:space="preserve">"What if the AI company shuts down?" → Files are portable. Swap to any other AI vendor in a day.</w:t>
+      </w:r>
+    </w:p>
+    <w:p>
+      <w:pPr>
+        <w:spacing w:after="100" w:before="240"/>
+      </w:pPr>
+      <w:r>
+        <w:rPr>
+          <w:b/>
+          <w:bCs/>
+          <w:color w:val="C0392B"/>
+          <w:sz w:val="24"/>
+          <w:szCs w:val="24"/>
+        </w:rPr>
+        <w:t xml:space="preserve">Your one-liner for the director:</w:t>
+      </w:r>
+    </w:p>
+    <w:p>
+      <w:pPr>
+        <w:spacing w:after="280"/>
+        <w:ind w:left="360"/>
+      </w:pPr>
+      <w:r>
+        <w:rPr>
+          <w:i/>
+          <w:iCs/>
+          <w:color w:val="404040"/>
+          <w:sz w:val="22"/>
+          <w:szCs w:val="22"/>
+        </w:rPr>
+        <w:t xml:space="preserve">"Same engineers. Same controls. Same compliance. 20-30% more work done — because AI handles the boring 40% so humans can focus on judgment."</w:t>
       </w:r>
     </w:p>
     <w:p>

</xml_diff>